<commit_message>
Safety alert: fill in [FirstName] from the reporter
The template asks people to "get in touch with [FirstName] directly", so
the placeholder sits mid-sentence rather than as a run of its own, which
is all replaceRunText can match. A plain substring swap instead — safe
blind because "[FirstName]" with its brackets collides with nothing else
in the document, unlike the bare "them" it replaced, which is a
substring of "theme" and "eastAsiaTheme" in the document's own XML.

Co-Authored-By: Claude Opus 5 <noreply@anthropic.com>
</commit_message>
<xml_diff>
--- a/server/src/assets/safety-alert-template.docx
+++ b/server/src/assets/safety-alert-template.docx
@@ -1088,7 +1088,7 @@
                                   <w:sz w:val="13"/>
                                   <w:szCs w:val="13"/>
                                 </w:rPr>
-                                <w:t xml:space="preserve">for bringing this issue to our attention. If you'd like more information or clarification on anything covered here, please get in touch with them directly.</w:t>
+                                <w:t xml:space="preserve">for bringing this issue to our attention. If you'd like more information or clarification on anything covered here, please get in touch with [FirstName] directly.</w:t>
                               </w:r>
                               <w:r>
                                 <w:rPr>
@@ -1097,7 +1097,7 @@
                                   <w:sz w:val="13"/>
                                   <w:szCs w:val="13"/>
                                 </w:rPr>
-                                <w:t xml:space="preserve"> You can reach them at </w:t>
+                                <w:t xml:space="preserve"> You can reach [FirstName] at </w:t>
                               </w:r>
                               <w:r>
                                 <w:rPr>
@@ -1112,7 +1112,7 @@
                             </w:p>
                           </w:txbxContent>
                         </wps:txbx>
-                        <wps:bodyPr rot="0" spcFirstLastPara="0" vertOverflow="overflow" horzOverflow="overflow" vert="horz" wrap="square" lIns="91440" tIns="45720" rIns="91440" bIns="45720" numCol="1" spcCol="0" rtlCol="0" fromWordArt="0" anchor="t" anchorCtr="0" forceAA="0" compatLnSpc="1">
+                        <wps:bodyPr rot="0" spcFirstLastPara="0" vertOverflow="overflow" horzOverflow="overflow" vert="horz" wrap="square" lIns="91440" tIns="45720" rIns="91440" bIns="45720" numCol="1" spcCol="0" rtlCol="0" fromWordArt="0" anchor="ctr" anchorCtr="0" forceAA="0" compatLnSpc="1">
                           <a:prstTxWarp prst="textNoShape">
                             <a:avLst/>
                           </a:prstTxWarp>

</xml_diff>